<commit_message>
Added bacterial signature table and unified bubble plot colors
</commit_message>
<xml_diff>
--- a/Microbiome_Brain_Tumors/output/tables/WGS/Brain_Mets_by_overall_progression_SSO_WGS_Stool.docx
+++ b/Microbiome_Brain_Tumors/output/tables/WGS/Brain_Mets_by_overall_progression_SSO_WGS_Stool.docx
@@ -859,7 +859,7 @@
                 <w:rFonts w:ascii="Calibri" w:hAnsi="Calibri"/>
                 <w:sz w:val="20"/>
               </w:rPr>
-              <w:t xml:space="default">0.3</w:t>
+              <w:t xml:space="default">0.4</w:t>
             </w:r>
             <w:r>
               <w:rPr>
@@ -2208,7 +2208,7 @@
                 <w:rFonts w:ascii="Calibri" w:hAnsi="Calibri"/>
                 <w:sz w:val="20"/>
               </w:rPr>
-              <w:t xml:space="default">0.073</w:t>
+              <w:t xml:space="default">0.057</w:t>
             </w:r>
             <w:r>
               <w:rPr>

</xml_diff>